<commit_message>
thêm thư mục LAB6
</commit_message>
<xml_diff>
--- a/LAB3/Lab3_CNPM2_1150080120_HoangThanhTra.docx
+++ b/LAB3/Lab3_CNPM2_1150080120_HoangThanhTra.docx
@@ -71,6 +71,10 @@
           <w:rFonts w:hint="default" w:ascii="Times New Roman" w:hAnsi="Times New Roman" w:cs="Times New Roman"/>
         </w:rPr>
         <w:t xml:space="preserve"> </w:t>
+      </w:r>
+      <w:r>
+        <w:rPr/>
+        <w:t>https://youtu.be/Z_w49hdhxG4</w:t>
       </w:r>
     </w:p>
     <w:p>

</xml_diff>